<commit_message>
Corregir superficie en PEB Preliminar: 79,45 m2 a 79,44 m2 (consistente con el resto del proyecto)
Co-Authored-By: Claude Sonnet 5 <noreply@anthropic.com>
</commit_message>
<xml_diff>
--- a/03_Documentos_Tecnicos/PEB_Preliminar_Pausa_Maule.docx
+++ b/03_Documentos_Tecnicos/PEB_Preliminar_Pausa_Maule.docx
@@ -315,7 +315,7 @@
                       <w:color w:val="FFFFFF"/>
                       <w:sz w:val="16"/>
                     </w:rPr>
-                    <w:t>79,45 m²</w:t>
+                    <w:t>79,44 m²</w:t>
                   </w:r>
                 </w:p>
               </w:tc>
@@ -606,7 +606,7 @@
                       <w:sz w:val="16"/>
                       <w:lang w:val="es-CL"/>
                     </w:rPr>
-                    <w:t>Utilizar BIM para diseñar, evaluar, documentar y comunicar un habitáculo modular de 79,45 m² útiles —quincha de 12 cm, estructura de madera, losa de hormigón pulido y cubierta de plancha ondulada— mediante un modelo digital centralizado y consistente.</w:t>
+                    <w:t>Utilizar BIM para diseñar, evaluar, documentar y comunicar un habitáculo modular de 79,44 m² útiles —quincha de 12 cm, estructura de madera, losa de hormigón pulido y cubierta de plancha ondulada— mediante un modelo digital centralizado y consistente.</w:t>
                   </w:r>
                 </w:p>
                 <w:p>
@@ -737,7 +737,7 @@
                       <w:sz w:val="15"/>
                       <w:lang w:val="es-CL"/>
                     </w:rPr>
-                    <w:t xml:space="preserve"> Controlar la retícula 3 × 3: 9 recintos, 79,45 m² útiles y 4,02 m de altura libre.</w:t>
+                    <w:t xml:space="preserve"> Controlar la retícula 3 × 3: 9 recintos, 79,44 m² útiles y 4,02 m de altura libre.</w:t>
                   </w:r>
                 </w:p>
                 <w:p>
@@ -1811,7 +1811,7 @@
                       <w:sz w:val="15"/>
                       <w:lang w:val="es-CL"/>
                     </w:rPr>
-                    <w:t>PLAN DE EJECUCIÓN BIM PRELIMINAR · 79,45 m²</w:t>
+                    <w:t>PLAN DE EJECUCIÓN BIM PRELIMINAR · 79,44 m²</w:t>
                   </w:r>
                 </w:p>
               </w:tc>
@@ -2528,7 +2528,7 @@
                       <w:sz w:val="16"/>
                       <w:lang w:val="es-CL"/>
                     </w:rPr>
-                    <w:t xml:space="preserve"> Cuadro de superficies: 9 recintos, 79,45 m² útiles.</w:t>
+                    <w:t xml:space="preserve"> Cuadro de superficies: 9 recintos, 79,44 m² útiles.</w:t>
                   </w:r>
                 </w:p>
                 <w:p>
@@ -2971,7 +2971,7 @@
                             <w:sz w:val="14"/>
                             <w:lang w:val="es-CL"/>
                           </w:rPr>
-                          <w:t>Superficies y parámetros revisados. 79,45 m² en 9 recintos.</w:t>
+                          <w:t>Superficies y parámetros revisados. 79,44 m² en 9 recintos.</w:t>
                         </w:r>
                       </w:p>
                     </w:tc>
@@ -4804,7 +4804,7 @@
                 <w:color w:val="6E6B64"/>
                 <w:sz w:val="14"/>
               </w:rPr>
-              <w:t>Nombre, Número, Nivel, Área y Perímetro completos en las 9 habitaciones (incluye PASILLO #09, Nivel N1, 2.59 m², agregada 08-09-2026). Departamento pendiente en las 9. Área total 79.44 m².</w:t>
+              <w:t>Nombre, Número, Nivel, Área y Perímetro completos en las 9 habitaciones (incluye PASILLO #09, Nivel N1, 2.59 m², agregada 08-09-2026). Departamento pendiente en las 9. Área total 79,44 m².</w:t>
             </w:r>
           </w:p>
         </w:tc>

</xml_diff>

<commit_message>
Actualizar superficie total en todos los documentos y la web: 79.44 m2 a 79.45 m2 (valor real verificado en Revit)
Co-Authored-By: Claude Sonnet 5 <noreply@anthropic.com>
</commit_message>
<xml_diff>
--- a/03_Documentos_Tecnicos/PEB_Preliminar_Pausa_Maule.docx
+++ b/03_Documentos_Tecnicos/PEB_Preliminar_Pausa_Maule.docx
@@ -315,7 +315,7 @@
                       <w:color w:val="FFFFFF"/>
                       <w:sz w:val="16"/>
                     </w:rPr>
-                    <w:t>79,44 m²</w:t>
+                    <w:t>79,45 m²</w:t>
                   </w:r>
                 </w:p>
               </w:tc>
@@ -606,7 +606,7 @@
                       <w:sz w:val="16"/>
                       <w:lang w:val="es-CL"/>
                     </w:rPr>
-                    <w:t>Utilizar BIM para diseñar, evaluar, documentar y comunicar un habitáculo modular de 79,44 m² útiles —quincha de 12 cm, estructura de madera, losa de hormigón pulido y cubierta de plancha ondulada— mediante un modelo digital centralizado y consistente.</w:t>
+                    <w:t>Utilizar BIM para diseñar, evaluar, documentar y comunicar un habitáculo modular de 79,45 m² útiles —quincha de 12 cm, estructura de madera, losa de hormigón pulido y cubierta de plancha ondulada— mediante un modelo digital centralizado y consistente.</w:t>
                   </w:r>
                 </w:p>
                 <w:p>
@@ -737,7 +737,7 @@
                       <w:sz w:val="15"/>
                       <w:lang w:val="es-CL"/>
                     </w:rPr>
-                    <w:t xml:space="preserve"> Controlar la retícula 3 × 3: 9 recintos, 79,44 m² útiles y 4,02 m de altura libre.</w:t>
+                    <w:t xml:space="preserve"> Controlar la retícula 3 × 3: 9 recintos, 79,45 m² útiles y 4,02 m de altura libre.</w:t>
                   </w:r>
                 </w:p>
                 <w:p>
@@ -1811,7 +1811,7 @@
                       <w:sz w:val="15"/>
                       <w:lang w:val="es-CL"/>
                     </w:rPr>
-                    <w:t>PLAN DE EJECUCIÓN BIM PRELIMINAR · 79,44 m²</w:t>
+                    <w:t>PLAN DE EJECUCIÓN BIM PRELIMINAR · 79,45 m²</w:t>
                   </w:r>
                 </w:p>
               </w:tc>
@@ -2528,7 +2528,7 @@
                       <w:sz w:val="16"/>
                       <w:lang w:val="es-CL"/>
                     </w:rPr>
-                    <w:t xml:space="preserve"> Cuadro de superficies: 9 recintos, 79,44 m² útiles.</w:t>
+                    <w:t xml:space="preserve"> Cuadro de superficies: 9 recintos, 79,45 m² útiles.</w:t>
                   </w:r>
                 </w:p>
                 <w:p>
@@ -2971,7 +2971,7 @@
                             <w:sz w:val="14"/>
                             <w:lang w:val="es-CL"/>
                           </w:rPr>
-                          <w:t>Superficies y parámetros revisados. 79,44 m² en 9 recintos.</w:t>
+                          <w:t>Superficies y parámetros revisados. 79,45 m² en 9 recintos.</w:t>
                         </w:r>
                       </w:p>
                     </w:tc>
@@ -4804,7 +4804,7 @@
                 <w:color w:val="6E6B64"/>
                 <w:sz w:val="14"/>
               </w:rPr>
-              <w:t>Nombre, Número, Nivel, Área y Perímetro completos en las 9 habitaciones (incluye PASILLO #09, Nivel N1, 2.59 m², agregada 08-09-2026). Departamento pendiente en las 9. Área total 79,44 m².</w:t>
+              <w:t>Nombre, Número, Nivel, Área y Perímetro completos en las 9 habitaciones (incluye PASILLO #09, Nivel N1, 2.59 m², agregada 08-09-2026). Departamento pendiente en las 9. Área total 79,45 m².</w:t>
             </w:r>
           </w:p>
         </w:tc>

</xml_diff>